<commit_message>
Fix independent S-DES key shifts and refresh experiment deliverables
</commit_message>
<xml_diff>
--- a/docs/S-DES实验报告.docx
+++ b/docs/S-DES实验报告.docx
@@ -521,7 +521,7 @@
               <w:pStyle w:val="ReportTable"/>
             </w:pPr>
             <w:r>
-              <w:t>C++11，MinGW GCC 4.9.2</w:t>
+              <w:t>C++11，MinGW GCC 13.1.0</w:t>
             </w:r>
           </w:p>
         </w:tc>
@@ -1223,7 +1223,7 @@
         <w:jc w:val="both"/>
       </w:pPr>
       <w:r>
-        <w:t>主密钥先经过 P10，分为两个 5 位半部。每个半部循环左移 1 位，合并后经 P8 得到 K1；在刚才的结果上继续循环左移 2 位，再经 P8 得到 K2。因此，生成 K2 时相对最初的半部共左移了 3 位。</w:t>
+        <w:t>主密钥先经过 P10，分为两个 5 位半部。两个子密钥均从这两个半部生成：分别循环左移 1 位，合并后经 P8 得到 K1；分别循环左移 2 位，合并后经 P8 得到 K2。密钥扩展为 Ki = P8(Shift^i(P10(K)))，i = 1, 2。</w:t>
       </w:r>
     </w:p>
     <w:p>
@@ -1646,7 +1646,7 @@
         <w:jc w:val="both"/>
       </w:pPr>
       <w:r>
-        <w:t>在分组加解密页输入明文 11010111 和密钥 1010000010，选择加密模式并运行。结果为 10001100；将该结果用作输入后切换到解密模式，输出恢复为 11010111。</w:t>
+        <w:t>在分组加解密页输入明文 11010111 和密钥 1010000010，选择加密模式并运行。结果为 11101000；将该结果用作输入后切换到解密模式，输出恢复为 11010111。</w:t>
       </w:r>
     </w:p>
     <w:p>
@@ -1890,7 +1890,7 @@
               <w:pStyle w:val="ReportTable"/>
             </w:pPr>
             <w:r>
-              <w:t>10001100</w:t>
+              <w:t>11101000</w:t>
             </w:r>
           </w:p>
         </w:tc>
@@ -1935,7 +1935,7 @@
               <w:pStyle w:val="ReportTable"/>
             </w:pPr>
             <w:r>
-              <w:t>10001100</w:t>
+              <w:t>11101000</w:t>
             </w:r>
           </w:p>
         </w:tc>
@@ -2001,7 +2001,7 @@
         <w:jc w:val="both"/>
       </w:pPr>
       <w:r>
-        <w:t>自动测试通过 20 项算法与边界检查，以及 28 项界面检查。界面检查覆盖加解密、结果复用、格式转换、搜索线程、导航和最小窗口尺寸。</w:t>
+        <w:t>自动测试通过 21 项算法与边界检查，以及 28 项界面检查。界面检查覆盖加解密、结果复用、格式转换、搜索线程、导航和最小窗口尺寸。</w:t>
       </w:r>
     </w:p>
     <w:p>
@@ -2019,7 +2019,7 @@
         <w:jc w:val="both"/>
       </w:pPr>
       <w:r>
-        <w:t>下表展开同一测试向量的中间步骤，用于核对位序、累积移位和两轮子密钥的使用顺序。</w:t>
+        <w:t>下表展开同一测试向量的中间步骤，用于核对位序、子密钥生成和两轮运算。异或记为 ⊕：相同两位得到 0，不同两位得到 1。轮函数先计算 EP(R) ⊕ K，再将 S-box 输出经 P4 后与左半部异或。</w:t>
       </w:r>
     </w:p>
     <w:tbl>
@@ -2244,7 +2244,7 @@
               <w:pStyle w:val="ReportTable"/>
             </w:pPr>
             <w:r>
-              <w:t>继续左移 2 位后的两半拼接</w:t>
+              <w:t>P10 两半左移 2 位后的拼接</w:t>
             </w:r>
           </w:p>
         </w:tc>
@@ -2264,7 +2264,7 @@
               <w:pStyle w:val="ReportTable"/>
             </w:pPr>
             <w:r>
-              <w:t>0010000011</w:t>
+              <w:t>0001010001</w:t>
             </w:r>
           </w:p>
         </w:tc>
@@ -2309,7 +2309,7 @@
               <w:pStyle w:val="ReportTable"/>
             </w:pPr>
             <w:r>
-              <w:t>01000011</w:t>
+              <w:t>10010010</w:t>
             </w:r>
           </w:p>
         </w:tc>
@@ -2534,7 +2534,7 @@
               <w:pStyle w:val="ReportTable"/>
             </w:pPr>
             <w:r>
-              <w:t>00010100 / 01010111</w:t>
+              <w:t>00010100 / 10000110</w:t>
             </w:r>
           </w:p>
         </w:tc>
@@ -2579,7 +2579,7 @@
               <w:pStyle w:val="ReportTable"/>
             </w:pPr>
             <w:r>
-              <w:t>01 / 00 / 1000</w:t>
+              <w:t>00 / 11 / 0110</w:t>
             </w:r>
           </w:p>
         </w:tc>
@@ -2624,7 +2624,7 @@
               <w:pStyle w:val="ReportTable"/>
             </w:pPr>
             <w:r>
-              <w:t>01010010 / 10001100</w:t>
+              <w:t>10110010 / 11101000</w:t>
             </w:r>
           </w:p>
         </w:tc>
@@ -2709,7 +2709,7 @@
         <w:jc w:val="both"/>
       </w:pPr>
       <w:r>
-        <w:t>Python 版本使用整数位运算，C++ 版本使用字符串置换。两者采用相同的置换表、S-box 和累积移位顺序。测试先比较两种实现对同一明文、同一密钥的加密结果，再把 Python 生成的密文交给 C++ 解密。</w:t>
+        <w:t>Python 版本使用整数位运算，C++ 版本使用字符串置换。两者采用相同的置换表、S-box 和子密钥生成方式。测试先比较两种实现对同一明文、同一密钥的加密结果，再把 Python 生成的密文交给 C++ 解密。</w:t>
       </w:r>
     </w:p>
     <w:tbl>
@@ -2991,7 +2991,7 @@
               <w:pStyle w:val="ReportTable"/>
             </w:pPr>
             <w:r>
-              <w:t>Python 64 位 / C++ i686</w:t>
+              <w:t>Python / C++ 均为 64 位</w:t>
             </w:r>
           </w:p>
         </w:tc>
@@ -3162,7 +3162,7 @@
               <w:pStyle w:val="ReportTable"/>
             </w:pPr>
             <w:r>
-              <w:t>00001110</w:t>
+              <w:t>01101010</w:t>
             </w:r>
           </w:p>
         </w:tc>
@@ -3182,7 +3182,7 @@
               <w:pStyle w:val="ReportTable"/>
             </w:pPr>
             <w:r>
-              <w:t>00001110</w:t>
+              <w:t>01101010</w:t>
             </w:r>
           </w:p>
         </w:tc>
@@ -3247,7 +3247,7 @@
               <w:pStyle w:val="ReportTable"/>
             </w:pPr>
             <w:r>
-              <w:t>10000001</w:t>
+              <w:t>01000101</w:t>
             </w:r>
           </w:p>
         </w:tc>
@@ -3267,7 +3267,7 @@
               <w:pStyle w:val="ReportTable"/>
             </w:pPr>
             <w:r>
-              <w:t>10000001</w:t>
+              <w:t>01000101</w:t>
             </w:r>
           </w:p>
         </w:tc>
@@ -3332,7 +3332,7 @@
               <w:pStyle w:val="ReportTable"/>
             </w:pPr>
             <w:r>
-              <w:t>00010101</w:t>
+              <w:t>10010001</w:t>
             </w:r>
           </w:p>
         </w:tc>
@@ -3352,7 +3352,7 @@
               <w:pStyle w:val="ReportTable"/>
             </w:pPr>
             <w:r>
-              <w:t>00010101</w:t>
+              <w:t>10010001</w:t>
             </w:r>
           </w:p>
         </w:tc>
@@ -3417,7 +3417,7 @@
               <w:pStyle w:val="ReportTable"/>
             </w:pPr>
             <w:r>
-              <w:t>11000001</w:t>
+              <w:t>00000101</w:t>
             </w:r>
           </w:p>
         </w:tc>
@@ -3437,7 +3437,7 @@
               <w:pStyle w:val="ReportTable"/>
             </w:pPr>
             <w:r>
-              <w:t>11000001</w:t>
+              <w:t>00000101</w:t>
             </w:r>
           </w:p>
         </w:tc>
@@ -3502,7 +3502,7 @@
               <w:pStyle w:val="ReportTable"/>
             </w:pPr>
             <w:r>
-              <w:t>10001101</w:t>
+              <w:t>00001001</w:t>
             </w:r>
           </w:p>
         </w:tc>
@@ -3522,7 +3522,7 @@
               <w:pStyle w:val="ReportTable"/>
             </w:pPr>
             <w:r>
-              <w:t>10001101</w:t>
+              <w:t>00001001</w:t>
             </w:r>
           </w:p>
         </w:tc>
@@ -3587,7 +3587,7 @@
               <w:pStyle w:val="ReportTable"/>
             </w:pPr>
             <w:r>
-              <w:t>10001100</w:t>
+              <w:t>11101000</w:t>
             </w:r>
           </w:p>
         </w:tc>
@@ -3607,7 +3607,7 @@
               <w:pStyle w:val="ReportTable"/>
             </w:pPr>
             <w:r>
-              <w:t>10001100</w:t>
+              <w:t>11101000</w:t>
             </w:r>
           </w:p>
         </w:tc>
@@ -3672,7 +3672,7 @@
               <w:pStyle w:val="ReportTable"/>
             </w:pPr>
             <w:r>
-              <w:t>11101010</w:t>
+              <w:t>10001110</w:t>
             </w:r>
           </w:p>
         </w:tc>
@@ -3692,7 +3692,7 @@
               <w:pStyle w:val="ReportTable"/>
             </w:pPr>
             <w:r>
-              <w:t>11101010</w:t>
+              <w:t>10001110</w:t>
             </w:r>
           </w:p>
         </w:tc>
@@ -3737,7 +3737,7 @@
         <w:jc w:val="both"/>
       </w:pPr>
       <w:r>
-        <w:t>与其他小组同学进行交叉测试，各项测试均通过。同一明文和密钥的加密结果一致，交换密文后能够解密恢复原文。</w:t>
+        <w:t>此前与其他小组同学进行的交叉测试均通过。本次修正子密钥生成后，测试向量已重新导出；修正版的外组互验结果待补充。</w:t>
       </w:r>
     </w:p>
     <w:tbl>
@@ -3802,7 +3802,7 @@
               <w:pStyle w:val="ReportTableHeader"/>
             </w:pPr>
             <w:r>
-              <w:t>结果</w:t>
+              <w:t>修正版结果</w:t>
             </w:r>
           </w:p>
         </w:tc>
@@ -3847,7 +3847,7 @@
               <w:pStyle w:val="ReportTable"/>
             </w:pPr>
             <w:r>
-              <w:t>通过</w:t>
+              <w:t>待互验</w:t>
             </w:r>
           </w:p>
         </w:tc>
@@ -3892,7 +3892,7 @@
               <w:pStyle w:val="ReportTable"/>
             </w:pPr>
             <w:r>
-              <w:t>通过</w:t>
+              <w:t>待互验</w:t>
             </w:r>
           </w:p>
         </w:tc>
@@ -4149,7 +4149,7 @@
               <w:pStyle w:val="ReportTable"/>
             </w:pPr>
             <w:r>
-              <w:t>C4 F8 0D 0D 2F 99 62 4F 36 5F 50 4F 29</w:t>
+              <w:t>E4 5C 89 89 AB DD C2 CB 56 9B 30 CB AD</w:t>
             </w:r>
           </w:p>
         </w:tc>
@@ -4194,7 +4194,7 @@
               <w:pStyle w:val="ReportTable"/>
             </w:pPr>
             <w:r>
-              <w:t>xPgNDS+ZYk82X1BPKQ==</w:t>
+              <w:t>5FyJiavdwstWmzDLrQ==</w:t>
             </w:r>
           </w:p>
         </w:tc>
@@ -4256,7 +4256,7 @@
         <w:jc w:val="both"/>
       </w:pPr>
       <w:r>
-        <w:t>密文中包含 C4、F8 等超出 ASCII 范围的字节，也包含 0D 等控制字符。界面提供 Hex、Base64 和转义字节三种表示，切换格式时转换的是同一组密文字节。</w:t>
+        <w:t>密文中包含 E4、89 等超出 ASCII 范围的字节，不能直接作为 ASCII 文本显示。界面提供 Hex、Base64 和转义字节三种表示，切换格式时转换的是同一组密文字节。</w:t>
       </w:r>
     </w:p>
     <w:p>
@@ -4292,7 +4292,7 @@
         <w:jc w:val="both"/>
       </w:pPr>
       <w:r>
-        <w:t>先输入明文 11010111、密文 10001100。搜索得到 0110000000、1010000010 和 1011001010 三把密钥，原始密钥 1010000010 包含在候选中。</w:t>
+        <w:t>先输入明文 11010111、密文 11101000。搜索得到 6 把密钥：0010110100、0110110100、1001011011、1010000010、1101011011、1110000010。原始密钥 1010000010 包含在候选中。</w:t>
       </w:r>
     </w:p>
     <w:p>
@@ -4351,7 +4351,7 @@
         <w:jc w:val="both"/>
       </w:pPr>
       <w:r>
-        <w:t>保持密钥不变，逐步增加不同明文对应的密文。候选数从 3 缩小到 1，五组输入见下表。</w:t>
+        <w:t>保持密钥不变，逐步增加不同明文对应的密文。候选数从 6 缩小到 2，2 组输入见下表。</w:t>
       </w:r>
     </w:p>
     <w:tbl>
@@ -4525,7 +4525,7 @@
               <w:pStyle w:val="ReportTable"/>
             </w:pPr>
             <w:r>
-              <w:t>10001100</w:t>
+              <w:t>11101000</w:t>
             </w:r>
           </w:p>
         </w:tc>
@@ -4545,7 +4545,7 @@
               <w:pStyle w:val="ReportTable"/>
             </w:pPr>
             <w:r>
-              <w:t>3</w:t>
+              <w:t>6</w:t>
             </w:r>
           </w:p>
         </w:tc>
@@ -4610,7 +4610,7 @@
               <w:pStyle w:val="ReportTable"/>
             </w:pPr>
             <w:r>
-              <w:t>00001110</w:t>
+              <w:t>01101010</w:t>
             </w:r>
           </w:p>
         </w:tc>
@@ -4631,261 +4631,6 @@
             </w:pPr>
             <w:r>
               <w:t>2</w:t>
-            </w:r>
-          </w:p>
-        </w:tc>
-      </w:tr>
-      <w:tr>
-        <w:trPr>
-          <w:cantSplit/>
-        </w:trPr>
-        <w:tc>
-          <w:tcPr>
-            <w:tcW w:type="dxa" w:w="1701"/>
-            <w:vAlign w:val="center"/>
-            <w:tcMar>
-              <w:top w:w="40" w:type="dxa"/>
-              <w:left w:w="40" w:type="dxa"/>
-              <w:bottom w:w="40" w:type="dxa"/>
-              <w:right w:w="40" w:type="dxa"/>
-            </w:tcMar>
-          </w:tcPr>
-          <w:p>
-            <w:pPr>
-              <w:pStyle w:val="ReportTable"/>
-            </w:pPr>
-            <w:r>
-              <w:t>3</w:t>
-            </w:r>
-          </w:p>
-        </w:tc>
-        <w:tc>
-          <w:tcPr>
-            <w:tcW w:type="dxa" w:w="2551"/>
-            <w:vAlign w:val="center"/>
-            <w:tcMar>
-              <w:top w:w="40" w:type="dxa"/>
-              <w:left w:w="40" w:type="dxa"/>
-              <w:bottom w:w="40" w:type="dxa"/>
-              <w:right w:w="40" w:type="dxa"/>
-            </w:tcMar>
-          </w:tcPr>
-          <w:p>
-            <w:pPr>
-              <w:pStyle w:val="ReportTable"/>
-            </w:pPr>
-            <w:r>
-              <w:t>00000001</w:t>
-            </w:r>
-          </w:p>
-        </w:tc>
-        <w:tc>
-          <w:tcPr>
-            <w:tcW w:type="dxa" w:w="2551"/>
-            <w:vAlign w:val="center"/>
-            <w:tcMar>
-              <w:top w:w="40" w:type="dxa"/>
-              <w:left w:w="40" w:type="dxa"/>
-              <w:bottom w:w="40" w:type="dxa"/>
-              <w:right w:w="40" w:type="dxa"/>
-            </w:tcMar>
-          </w:tcPr>
-          <w:p>
-            <w:pPr>
-              <w:pStyle w:val="ReportTable"/>
-            </w:pPr>
-            <w:r>
-              <w:t>10000001</w:t>
-            </w:r>
-          </w:p>
-        </w:tc>
-        <w:tc>
-          <w:tcPr>
-            <w:tcW w:type="dxa" w:w="2268"/>
-            <w:vAlign w:val="center"/>
-            <w:tcMar>
-              <w:top w:w="40" w:type="dxa"/>
-              <w:left w:w="40" w:type="dxa"/>
-              <w:bottom w:w="40" w:type="dxa"/>
-              <w:right w:w="40" w:type="dxa"/>
-            </w:tcMar>
-          </w:tcPr>
-          <w:p>
-            <w:pPr>
-              <w:pStyle w:val="ReportTable"/>
-            </w:pPr>
-            <w:r>
-              <w:t>2</w:t>
-            </w:r>
-          </w:p>
-        </w:tc>
-      </w:tr>
-      <w:tr>
-        <w:trPr>
-          <w:cantSplit/>
-        </w:trPr>
-        <w:tc>
-          <w:tcPr>
-            <w:tcW w:type="dxa" w:w="1701"/>
-            <w:vAlign w:val="center"/>
-            <w:tcMar>
-              <w:top w:w="40" w:type="dxa"/>
-              <w:left w:w="40" w:type="dxa"/>
-              <w:bottom w:w="40" w:type="dxa"/>
-              <w:right w:w="40" w:type="dxa"/>
-            </w:tcMar>
-          </w:tcPr>
-          <w:p>
-            <w:pPr>
-              <w:pStyle w:val="ReportTable"/>
-            </w:pPr>
-            <w:r>
-              <w:t>4</w:t>
-            </w:r>
-          </w:p>
-        </w:tc>
-        <w:tc>
-          <w:tcPr>
-            <w:tcW w:type="dxa" w:w="2551"/>
-            <w:vAlign w:val="center"/>
-            <w:tcMar>
-              <w:top w:w="40" w:type="dxa"/>
-              <w:left w:w="40" w:type="dxa"/>
-              <w:bottom w:w="40" w:type="dxa"/>
-              <w:right w:w="40" w:type="dxa"/>
-            </w:tcMar>
-          </w:tcPr>
-          <w:p>
-            <w:pPr>
-              <w:pStyle w:val="ReportTable"/>
-            </w:pPr>
-            <w:r>
-              <w:t>01000001</w:t>
-            </w:r>
-          </w:p>
-        </w:tc>
-        <w:tc>
-          <w:tcPr>
-            <w:tcW w:type="dxa" w:w="2551"/>
-            <w:vAlign w:val="center"/>
-            <w:tcMar>
-              <w:top w:w="40" w:type="dxa"/>
-              <w:left w:w="40" w:type="dxa"/>
-              <w:bottom w:w="40" w:type="dxa"/>
-              <w:right w:w="40" w:type="dxa"/>
-            </w:tcMar>
-          </w:tcPr>
-          <w:p>
-            <w:pPr>
-              <w:pStyle w:val="ReportTable"/>
-            </w:pPr>
-            <w:r>
-              <w:t>00010101</w:t>
-            </w:r>
-          </w:p>
-        </w:tc>
-        <w:tc>
-          <w:tcPr>
-            <w:tcW w:type="dxa" w:w="2268"/>
-            <w:vAlign w:val="center"/>
-            <w:tcMar>
-              <w:top w:w="40" w:type="dxa"/>
-              <w:left w:w="40" w:type="dxa"/>
-              <w:bottom w:w="40" w:type="dxa"/>
-              <w:right w:w="40" w:type="dxa"/>
-            </w:tcMar>
-          </w:tcPr>
-          <w:p>
-            <w:pPr>
-              <w:pStyle w:val="ReportTable"/>
-            </w:pPr>
-            <w:r>
-              <w:t>2</w:t>
-            </w:r>
-          </w:p>
-        </w:tc>
-      </w:tr>
-      <w:tr>
-        <w:trPr>
-          <w:cantSplit/>
-        </w:trPr>
-        <w:tc>
-          <w:tcPr>
-            <w:tcW w:type="dxa" w:w="1701"/>
-            <w:vAlign w:val="center"/>
-            <w:tcMar>
-              <w:top w:w="40" w:type="dxa"/>
-              <w:left w:w="40" w:type="dxa"/>
-              <w:bottom w:w="40" w:type="dxa"/>
-              <w:right w:w="40" w:type="dxa"/>
-            </w:tcMar>
-          </w:tcPr>
-          <w:p>
-            <w:pPr>
-              <w:pStyle w:val="ReportTable"/>
-            </w:pPr>
-            <w:r>
-              <w:t>5</w:t>
-            </w:r>
-          </w:p>
-        </w:tc>
-        <w:tc>
-          <w:tcPr>
-            <w:tcW w:type="dxa" w:w="2551"/>
-            <w:vAlign w:val="center"/>
-            <w:tcMar>
-              <w:top w:w="40" w:type="dxa"/>
-              <w:left w:w="40" w:type="dxa"/>
-              <w:bottom w:w="40" w:type="dxa"/>
-              <w:right w:w="40" w:type="dxa"/>
-            </w:tcMar>
-          </w:tcPr>
-          <w:p>
-            <w:pPr>
-              <w:pStyle w:val="ReportTable"/>
-            </w:pPr>
-            <w:r>
-              <w:t>01010101</w:t>
-            </w:r>
-          </w:p>
-        </w:tc>
-        <w:tc>
-          <w:tcPr>
-            <w:tcW w:type="dxa" w:w="2551"/>
-            <w:vAlign w:val="center"/>
-            <w:tcMar>
-              <w:top w:w="40" w:type="dxa"/>
-              <w:left w:w="40" w:type="dxa"/>
-              <w:bottom w:w="40" w:type="dxa"/>
-              <w:right w:w="40" w:type="dxa"/>
-            </w:tcMar>
-          </w:tcPr>
-          <w:p>
-            <w:pPr>
-              <w:pStyle w:val="ReportTable"/>
-            </w:pPr>
-            <w:r>
-              <w:t>11000001</w:t>
-            </w:r>
-          </w:p>
-        </w:tc>
-        <w:tc>
-          <w:tcPr>
-            <w:tcW w:type="dxa" w:w="2268"/>
-            <w:vAlign w:val="center"/>
-            <w:tcMar>
-              <w:top w:w="40" w:type="dxa"/>
-              <w:left w:w="40" w:type="dxa"/>
-              <w:bottom w:w="40" w:type="dxa"/>
-              <w:right w:w="40" w:type="dxa"/>
-            </w:tcMar>
-          </w:tcPr>
-          <w:p>
-            <w:pPr>
-              <w:pStyle w:val="ReportTable"/>
-            </w:pPr>
-            <w:r>
-              <w:t>1</w:t>
             </w:r>
           </w:p>
         </w:tc>
@@ -4911,7 +4656,7 @@
         <w:jc w:val="both"/>
       </w:pPr>
       <w:r>
-        <w:t>加入五组明密文对后，唯一候选为 1010000010。搜索运行在 Qt 后台线程中，进度和结果通过信号传回主窗口。停止操作返回已检查范围内的候选；相同明文配上两个不同密文时，结果为空。</w:t>
+        <w:t>加入 2 组明密文对后，剩余候选为 1010000010 和 1110000010。两把密钥生成相同的 K1、K2，对全部 256 个明文的加密结果均相同。搜索运行在 Qt 后台线程中；停止操作返回已检查范围内的候选，相互矛盾的已知对得到空结果。</w:t>
       </w:r>
     </w:p>
     <w:p>
@@ -4924,7 +4669,7 @@
         <w:drawing>
           <wp:inline xmlns:a="http://schemas.openxmlformats.org/drawingml/2006/main" xmlns:pic="http://schemas.openxmlformats.org/drawingml/2006/picture">
             <wp:extent cx="5040000" cy="3502372"/>
-            <wp:docPr id="5" name="Picture 5" descr="图5 五组明密文对恢复唯一密钥"/>
+            <wp:docPr id="5" name="Picture 5" descr="图5 多组明密文对的两个等价候选"/>
             <wp:cNvGraphicFramePr>
               <a:graphicFrameLocks noChangeAspect="1"/>
             </wp:cNvGraphicFramePr>
@@ -4961,7 +4706,7 @@
         <w:jc w:val="center"/>
       </w:pPr>
       <w:r>
-        <w:t>图5 五组明密文对恢复唯一密钥</w:t>
+        <w:t>图5 多组明密文对的两个等价候选</w:t>
       </w:r>
     </w:p>
     <w:tbl>
@@ -5071,7 +4816,7 @@
               <w:pStyle w:val="ReportTable"/>
             </w:pPr>
             <w:r>
-              <w:t>8.9953 ms</w:t>
+              <w:t>4.2847 ms</w:t>
             </w:r>
           </w:p>
         </w:tc>
@@ -5096,7 +4841,7 @@
               <w:pStyle w:val="ReportTable"/>
             </w:pPr>
             <w:r>
-              <w:t>GUI 五组明密文对</w:t>
+              <w:t>GUI 2 组明密文对</w:t>
             </w:r>
           </w:p>
         </w:tc>
@@ -5116,7 +4861,7 @@
               <w:pStyle w:val="ReportTable"/>
             </w:pPr>
             <w:r>
-              <w:t>1.6498 ms</w:t>
+              <w:t>1.2029 ms</w:t>
             </w:r>
           </w:p>
         </w:tc>
@@ -5161,7 +4906,7 @@
               <w:pStyle w:val="ReportTable"/>
             </w:pPr>
             <w:r>
-              <w:t>8.2247 ms</w:t>
+              <w:t>4.1060 ms</w:t>
             </w:r>
           </w:p>
         </w:tc>
@@ -5206,7 +4951,7 @@
               <w:pStyle w:val="ReportTable"/>
             </w:pPr>
             <w:r>
-              <w:t>1.4790 ms</w:t>
+              <w:t>1.1523 ms</w:t>
             </w:r>
           </w:p>
         </w:tc>
@@ -5251,7 +4996,7 @@
               <w:pStyle w:val="ReportTable"/>
             </w:pPr>
             <w:r>
-              <w:t>0.9108 / 2.5858 ms</w:t>
+              <w:t>0.9805 / 2.1348 ms</w:t>
             </w:r>
           </w:p>
         </w:tc>
@@ -5268,7 +5013,7 @@
         <w:jc w:val="both"/>
       </w:pPr>
       <w:r>
-        <w:t>耗时由 perf_counter_ns 记录，测量范围为密钥搜索循环。五组输入的 UTC 时间戳如下，界面按本地时区显示。</w:t>
+        <w:t>耗时由 perf_counter_ns 记录，测量范围为密钥搜索循环。多组输入的 UTC 时间戳如下，界面按本地时区显示。</w:t>
       </w:r>
     </w:p>
     <w:p>
@@ -5276,7 +5021,7 @@
         <w:pStyle w:val="ReportCode"/>
       </w:pPr>
       <w:r>
-        <w:t>开始 2026-10-07T04:04:25.481661+00:00</w:t>
+        <w:t>开始 2026-10-07T13:34:58.451453+00:00</w:t>
       </w:r>
     </w:p>
     <w:p>
@@ -5284,7 +5029,7 @@
         <w:pStyle w:val="ReportCode"/>
       </w:pPr>
       <w:r>
-        <w:t>结束 2026-10-07T04:04:25.483661+00:00</w:t>
+        <w:t>结束 2026-10-07T13:34:58.452801+00:00</w:t>
       </w:r>
     </w:p>
     <w:p>
@@ -5315,7 +5060,7 @@
         <w:jc w:val="both"/>
       </w:pPr>
       <w:r>
-        <w:t>使用随机种子 20261007 生成明文 P=01110100 和密钥 K=1011010110，加密得到 C=11111010。对这一组明密文穷举，得到 6 把候选密钥：</w:t>
+        <w:t>使用随机种子 20261007 生成明文 P=01110100 和密钥 K=1011010110，加密得到 C=01011010。对这一组明密文穷举，得到 4 把候选密钥：</w:t>
       </w:r>
     </w:p>
     <w:p>
@@ -5323,39 +5068,7 @@
         <w:pStyle w:val="ReportCode"/>
       </w:pPr>
       <w:r>
-        <w:t>0100010011</w:t>
-      </w:r>
-    </w:p>
-    <w:p>
-      <w:pPr>
-        <w:pStyle w:val="ReportCode"/>
-      </w:pPr>
-      <w:r>
-        <w:t>0101011011</w:t>
-      </w:r>
-    </w:p>
-    <w:p>
-      <w:pPr>
-        <w:pStyle w:val="ReportCode"/>
-      </w:pPr>
-      <w:r>
-        <w:t>0110010110</w:t>
-      </w:r>
-    </w:p>
-    <w:p>
-      <w:pPr>
-        <w:pStyle w:val="ReportCode"/>
-      </w:pPr>
-      <w:r>
-        <w:t>0111011110</w:t>
-      </w:r>
-    </w:p>
-    <w:p>
-      <w:pPr>
-        <w:pStyle w:val="ReportCode"/>
-      </w:pPr>
-      <w:r>
-        <w:t>1010011110</w:t>
+        <w:t>1000101111</w:t>
       </w:r>
     </w:p>
     <w:p>
@@ -5368,11 +5081,27 @@
     </w:p>
     <w:p>
       <w:pPr>
+        <w:pStyle w:val="ReportCode"/>
+      </w:pPr>
+      <w:r>
+        <w:t>1100101111</w:t>
+      </w:r>
+    </w:p>
+    <w:p>
+      <w:pPr>
+        <w:pStyle w:val="ReportCode"/>
+      </w:pPr>
+      <w:r>
+        <w:t>1111010110</w:t>
+      </w:r>
+    </w:p>
+    <w:p>
+      <w:pPr>
         <w:ind w:firstLine="480"/>
         <w:jc w:val="both"/>
       </w:pPr>
       <w:r>
-        <w:t>该样本对应多个密钥。对于一般的明密文对，候选数量取决于具体的 P 和 C：可能没有候选，也可能只有一个或存在多个。固定 P=11010111 时，有 16 种密文各自只对应一把密钥。</w:t>
+        <w:t>该样本对应多个密钥。若明密文对由加密程序生成，至少存在一把原始密钥；本次构造中，主密钥第 2 位不进入两个子密钥，因此翻转这一位会得到另一把等价密钥。若任意独立选择 P 和 C，则还可能选中不可达的密文而没有候选。</w:t>
       </w:r>
     </w:p>
     <w:p>
@@ -5643,7 +5372,7 @@
               <w:pStyle w:val="ReportTable"/>
             </w:pPr>
             <w:r>
-              <w:t>238 至 240</w:t>
+              <w:t>254 至 254</w:t>
             </w:r>
           </w:p>
         </w:tc>
@@ -5688,7 +5417,7 @@
               <w:pStyle w:val="ReportTable"/>
             </w:pPr>
             <w:r>
-              <w:t>12</w:t>
+              <w:t>8</w:t>
             </w:r>
           </w:p>
         </w:tc>
@@ -5733,7 +5462,7 @@
               <w:pStyle w:val="ReportTable"/>
             </w:pPr>
             <w:r>
-              <w:t>224 / 16</w:t>
+              <w:t>254 / 0</w:t>
             </w:r>
           </w:p>
         </w:tc>
@@ -5778,7 +5507,7 @@
               <w:pStyle w:val="ReportTable"/>
             </w:pPr>
             <w:r>
-              <w:t>2296</w:t>
+              <w:t>1728</w:t>
             </w:r>
           </w:p>
         </w:tc>
@@ -5823,7 +5552,7 @@
               <w:pStyle w:val="ReportTable"/>
             </w:pPr>
             <w:r>
-              <w:t>1024</w:t>
+              <w:t>512</w:t>
             </w:r>
           </w:p>
         </w:tc>
@@ -5868,7 +5597,7 @@
               <w:pStyle w:val="ReportTable"/>
             </w:pPr>
             <w:r>
-              <w:t>0</w:t>
+              <w:t>512</w:t>
             </w:r>
           </w:p>
         </w:tc>
@@ -5944,7 +5673,7 @@
         <w:jc w:val="both"/>
       </w:pPr>
       <w:r>
-        <w:t>以 P=11010111 为例，1024 把密钥产生 240 种密文，其中 224 种对应多把密钥。例如密文 10001100 对应第四关得到的三把候选密钥。</w:t>
+        <w:t>以 P=11010111 为例，1024 把密钥产生 254 种密文，每种可达密文均对应多把密钥。例如密文 11101000 对应第四关得到的 6 把候选密钥。</w:t>
       </w:r>
     </w:p>
     <w:p>
@@ -5953,7 +5682,7 @@
         <w:jc w:val="both"/>
       </w:pPr>
       <w:r>
-        <w:t>进一步比较每把密钥对全部 256 个明文的加密结果，得到 1024 种不同排列。因此，本实验中两把密钥在某个明文上碰撞，并不表示它们对所有明文都等价。固定密钥时明文可逆，固定明文时密钥可能碰撞，两种现象分别对应不同的映射关系。</w:t>
+        <w:t>进一步比较每把密钥对全部 256 个明文的加密结果，得到 512 种不同排列和 512 组等价密钥，每组两把。仅在一个明文上碰撞的密钥仍可能被其他明密文对区分；生成相同子密钥的等价密钥则无法通过增加输入区分。固定密钥时明文可逆，固定明文时密钥可能碰撞，两种现象分别对应不同映射。</w:t>
       </w:r>
     </w:p>
     <w:p>
@@ -5970,7 +5699,7 @@
         <w:jc w:val="both"/>
       </w:pPr>
       <w:r>
-        <w:t>本次实验完成了分组加解密、ASCII 扩展、已知明密文搜索和碰撞分析。Python 与 C++ 对全部输入组合的加密结果一致，与其他小组的交叉测试均通过。单组明密文对产生多个候选，而增加约束后可以确定唯一候选。</w:t>
+        <w:t>本次实验完成了分组加解密、ASCII 扩展、已知明密文搜索和碰撞分析。Python 与 C++ 对全部输入组合的加密结果一致。单组明密文对产生多个候选，增加约束可以缩小候选范围，但无法区分生成相同子密钥的等价密钥。</w:t>
       </w:r>
     </w:p>
     <w:p>
@@ -5979,7 +5708,7 @@
         <w:jc w:val="both"/>
       </w:pPr>
       <w:r>
-        <w:t>实现中需要留意两处细节：第二次密钥移位接续第一次移位结果；密文按字节保存，显示时再转换为 Hex、Base64 或转义形式。S-DES 的密钥空间很小，可以直接穷举，适合观察分组密码结构与密钥碰撞。</w:t>
+        <w:t>两个子密钥分别从 P10 的同一结果生成。密文按字节保存，显示时再转换为 Hex、Base64 或转义形式。S-DES 的密钥空间很小，可以直接穷举，适合观察分组密码结构与密钥碰撞。</w:t>
       </w:r>
     </w:p>
     <w:p>

</xml_diff>

<commit_message>
Record completed cross-group testing in final reports
</commit_message>
<xml_diff>
--- a/docs/S-DES实验报告.docx
+++ b/docs/S-DES实验报告.docx
@@ -3737,7 +3737,7 @@
         <w:jc w:val="both"/>
       </w:pPr>
       <w:r>
-        <w:t>此前与其他小组同学进行的交叉测试均通过。本次修正子密钥生成后，测试向量已重新导出；修正版的外组互验结果待补充。</w:t>
+        <w:t>与其他小组同学完成修正版程序的交叉测试，各项测试均通过。同一明文和密钥的加密结果一致，交换密文后能够解密恢复原文。</w:t>
       </w:r>
     </w:p>
     <w:tbl>
@@ -3802,7 +3802,7 @@
               <w:pStyle w:val="ReportTableHeader"/>
             </w:pPr>
             <w:r>
-              <w:t>修正版结果</w:t>
+              <w:t>结果</w:t>
             </w:r>
           </w:p>
         </w:tc>
@@ -3847,7 +3847,7 @@
               <w:pStyle w:val="ReportTable"/>
             </w:pPr>
             <w:r>
-              <w:t>待互验</w:t>
+              <w:t>通过</w:t>
             </w:r>
           </w:p>
         </w:tc>
@@ -3892,7 +3892,7 @@
               <w:pStyle w:val="ReportTable"/>
             </w:pPr>
             <w:r>
-              <w:t>待互验</w:t>
+              <w:t>通过</w:t>
             </w:r>
           </w:p>
         </w:tc>
@@ -5699,7 +5699,7 @@
         <w:jc w:val="both"/>
       </w:pPr>
       <w:r>
-        <w:t>本次实验完成了分组加解密、ASCII 扩展、已知明密文搜索和碰撞分析。Python 与 C++ 对全部输入组合的加密结果一致。单组明密文对产生多个候选，增加约束可以缩小候选范围，但无法区分生成相同子密钥的等价密钥。</w:t>
+        <w:t>本次实验完成了分组加解密、ASCII 扩展、已知明密文搜索和碰撞分析。Python 与 C++ 对全部输入组合的加密结果一致，与其他小组的交叉测试均通过。单组明密文对产生多个候选，增加约束可以缩小候选范围，但无法区分生成相同子密钥的等价密钥。</w:t>
       </w:r>
     </w:p>
     <w:p>

</xml_diff>